<commit_message>
cumcm-mathmodel-skill: absorb material corpus insights and add equation export
</commit_message>
<xml_diff>
--- a/skills/cumcm-writing/templates/paper-template.docx
+++ b/skills/cumcm-writing/templates/paper-template.docx
@@ -18,7 +18,7 @@
     </w:p>
     <w:p>
       <w:r>
-        <w:t>【待替换】逐节替换全部提示；交稿前全局搜索 【待替换】，确认标题、正文、表题、表格和图示槽位均无残留。</w:t>
+        <w:t>【待替换】逐节替换全部提示；完稿时按“结论←结果←模型←小问”反查，确认模型已有验证、代码与附件能够复现，断链时先补证据；交稿前全局搜索 【待替换】，确认标题、正文、表题、表格和图示槽位均无残留。</w:t>
       </w:r>
     </w:p>
     <w:p>
@@ -75,7 +75,7 @@
     </w:p>
     <w:p>
       <w:r>
-        <w:t>【待替换】用自己的语言把题面转换为输入、约束、目标和逐问交付物，不复制长段原题。</w:t>
+        <w:t>【待替换】用自己的语言把题面转换为输入、约束、目标和逐问交付物，不复制长段原题；本章必须改写，篇幅半页到一页。</w:t>
       </w:r>
     </w:p>
     <w:p>
@@ -93,7 +93,7 @@
     </w:p>
     <w:p>
       <w:r>
-        <w:t>【待替换】先概括全题的数学结构和信息流，再逐问交代难点、路线选择、预期输出与验证方式。</w:t>
+        <w:t>【待替换】先概括全题的数学结构和信息流，再逐问交代难点、路线选择、预期输出与验证方式，每问 10 行左右。</w:t>
       </w:r>
     </w:p>
     <w:p>
@@ -485,17 +485,17 @@
         <w:pStyle w:val="Heading1"/>
       </w:pPr>
       <w:r>
-        <w:t>5. 数据与预处理</w:t>
+        <w:t>5. 数据处理与特征分析</w:t>
       </w:r>
     </w:p>
     <w:p>
       <w:r>
-        <w:t>【待替换】说明数据来源、字段、单位、缺失与异常处理；官方附件保持只读，派生数据注明输出路径和变换。</w:t>
+        <w:t>【待替换】仅当多个子问题共用数据或处理流程时保留本章，否则并入对应问题小节；说明数据来源、字段、单位、缺失与异常处理，官方附件保持只读，派生数据注明输出路径和变换。</w:t>
       </w:r>
     </w:p>
     <w:p>
       <w:r>
-        <w:t>【待替换】只报告会影响模型选择或结果解释的数据特征，不把探索性观察写成因果结论。</w:t>
+        <w:t>【待替换】只报告会影响模型选择或结果解释的数据特征，不把探索性观察写成因果结论；每张图表只支持一个核心判断，正文按编号引用并说明它影响了哪个模型或决策。</w:t>
       </w:r>
     </w:p>
     <w:p>
@@ -503,17 +503,25 @@
         <w:pStyle w:val="Heading1"/>
       </w:pPr>
       <w:r>
-        <w:t>6. 各子问题的模型、求解与结果</w:t>
+        <w:t>6. 模型建立与求解</w:t>
       </w:r>
     </w:p>
     <w:p>
       <w:r>
-        <w:t>【待替换】按子问题建立“目标与机制—模型与公式—算法与参数—结果—验证—解释—边界”的完整证据链。</w:t>
+        <w:t>【待替换】每个子问题一节，按“模型建立—模型求解—结果分析与检验”组织，节尾以关键结果、单位、现实解释和一项验证直接回答本问；按赛题问题数量增删小节，并说明与前一问的传递关系。</w:t>
+      </w:r>
+    </w:p>
+    <w:p>
+      <w:pPr>
+        <w:pStyle w:val="Heading2"/>
+      </w:pPr>
+      <w:r>
+        <w:t>6.1 问题一的模型建立与求解</w:t>
       </w:r>
     </w:p>
     <w:p>
       <w:r>
-        <w:t>【待替换】下方为车道 C 的概念图槽位，只表达待制作需求，不得作为定量结果或已定稿证据。</w:t>
+        <w:t>【待替换】按“目标与机制—模型与公式—算法与参数—结果—验证—解释—边界”的完整证据链展开；下方为车道 C 的概念图槽位，只表达待制作需求，不得作为定量结果或已定稿证据。</w:t>
       </w:r>
     </w:p>
     <w:tbl>
@@ -547,7 +555,7 @@
               <w:br/>
               <w:t>车道：C</w:t>
               <w:br/>
-              <w:t>所在章节：6</w:t>
+              <w:t>所在章节：6.1</w:t>
               <w:br/>
               <w:t>期望内容：关键机制概念图占位</w:t>
             </w:r>
@@ -574,7 +582,20 @@
         <w:pStyle w:val="Heading1"/>
       </w:pPr>
       <w:r>
-        <w:t>7. 模型评价与改进</w:t>
+        <w:t>7. 模型检验</w:t>
+      </w:r>
+    </w:p>
+    <w:p>
+      <w:r>
+        <w:t>【待替换】仅当存在跨问题、跨模型或整体性的检验时保留本章，单个模型的常规检验放对应问题小节；没有实际检验结果时删除本章，不得声称模型稳定、鲁棒或普适。</w:t>
+      </w:r>
+    </w:p>
+    <w:p>
+      <w:pPr>
+        <w:pStyle w:val="Heading1"/>
+      </w:pPr>
+      <w:r>
+        <w:t>8. 模型评价与改进</w:t>
       </w:r>
     </w:p>
     <w:p>
@@ -592,7 +613,7 @@
         <w:pStyle w:val="Heading1"/>
       </w:pPr>
       <w:r>
-        <w:t>8. 参考文献</w:t>
+        <w:t>9. 参考文献</w:t>
       </w:r>
     </w:p>
     <w:p>
@@ -606,7 +627,7 @@
         <w:pageBreakBefore/>
       </w:pPr>
       <w:r>
-        <w:t>9. 附录</w:t>
+        <w:t>10. 附录</w:t>
       </w:r>
     </w:p>
     <w:p>
@@ -1061,14 +1082,14 @@
     <w:qFormat/>
     <w:rsid w:val="00FC693F"/>
     <w:pPr>
-      <w:spacing w:line="360" w:lineRule="auto" w:after="0"/>
-      <w:ind w:firstLine="420"/>
+      <w:spacing w:line="312" w:lineRule="auto" w:after="0"/>
+      <w:ind w:firstLine="482"/>
     </w:pPr>
     <w:rPr>
       <w:rFonts w:ascii="Times New Roman" w:hAnsi="Times New Roman" w:eastAsia="宋体"/>
       <w:b w:val="0"/>
       <w:color w:val="000000"/>
-      <w:sz w:val="21"/>
+      <w:sz w:val="24"/>
     </w:rPr>
   </w:style>
   <w:style w:type="paragraph" w:styleId="Header">
@@ -1127,6 +1148,7 @@
       <w:keepNext/>
       <w:keepLines/>
       <w:spacing w:before="160" w:after="120"/>
+      <w:jc w:val="center"/>
       <w:outlineLvl w:val="0"/>
     </w:pPr>
     <w:rPr>
@@ -1134,7 +1156,7 @@
       <w:b/>
       <w:bCs/>
       <w:color w:val="000000"/>
-      <w:sz w:val="32"/>
+      <w:sz w:val="28"/>
       <w:szCs w:val="28"/>
     </w:rPr>
   </w:style>
@@ -1154,11 +1176,11 @@
       <w:outlineLvl w:val="1"/>
     </w:pPr>
     <w:rPr>
-      <w:rFonts w:asciiTheme="majorHAnsi" w:eastAsiaTheme="majorEastAsia" w:hAnsiTheme="majorHAnsi" w:cstheme="majorBidi" w:ascii="Times New Roman" w:hAnsi="Times New Roman" w:eastAsia="黑体"/>
+      <w:rFonts w:asciiTheme="majorHAnsi" w:eastAsiaTheme="majorEastAsia" w:hAnsiTheme="majorHAnsi" w:cstheme="majorBidi" w:ascii="Times New Roman" w:hAnsi="Times New Roman" w:eastAsia="宋体"/>
       <w:b/>
       <w:bCs/>
       <w:color w:val="000000"/>
-      <w:sz w:val="28"/>
+      <w:sz w:val="24"/>
       <w:szCs w:val="26"/>
     </w:rPr>
   </w:style>
@@ -1178,7 +1200,7 @@
       <w:outlineLvl w:val="2"/>
     </w:pPr>
     <w:rPr>
-      <w:rFonts w:asciiTheme="majorHAnsi" w:eastAsiaTheme="majorEastAsia" w:hAnsiTheme="majorHAnsi" w:cstheme="majorBidi" w:ascii="Times New Roman" w:hAnsi="Times New Roman" w:eastAsia="黑体"/>
+      <w:rFonts w:asciiTheme="majorHAnsi" w:eastAsiaTheme="majorEastAsia" w:hAnsiTheme="majorHAnsi" w:cstheme="majorBidi" w:ascii="Times New Roman" w:hAnsi="Times New Roman" w:eastAsia="宋体"/>
       <w:b/>
       <w:bCs/>
       <w:color w:val="000000"/>
@@ -1423,7 +1445,7 @@
       <w:color w:val="000000"/>
       <w:spacing w:val="5"/>
       <w:kern w:val="28"/>
-      <w:sz w:val="36"/>
+      <w:sz w:val="32"/>
       <w:szCs w:val="52"/>
     </w:rPr>
   </w:style>
@@ -1865,7 +1887,7 @@
       <w:b w:val="0"/>
       <w:bCs/>
       <w:color w:val="000000"/>
-      <w:sz w:val="18"/>
+      <w:sz w:val="21"/>
       <w:szCs w:val="18"/>
     </w:rPr>
   </w:style>

</xml_diff>